<commit_message>
listado de asignaturas que se muestren en el dashboard
</commit_message>
<xml_diff>
--- a/data/output/programa_CFG_111.docx
+++ b/data/output/programa_CFG_111.docx
@@ -2982,7 +2982,7 @@
               <w:rPr>
                 <w:sz w:val="24"/>
               </w:rPr>
-              <w:t>Desarrollo Personal TEST 1 TEST2 TEST 3</w:t>
+              <w:t>Desarrollo Personal</w:t>
             </w:r>
             <w:r>
               <w:rPr>
@@ -3094,7 +3094,7 @@
                 <w:spacing w:val="-3"/>
                 <w:sz w:val="24"/>
               </w:rPr>
-              <w:t>Con requisitos TEST</w:t>
+              <w:t xml:space="preserve">Con requisitos </w:t>
             </w:r>
           </w:p>
         </w:tc>
@@ -3556,106 +3556,6 @@
           <w:sz w:val="24"/>
         </w:rPr>
       </w:pPr>
-    </w:p>
-    <w:p>
-      <w:pPr>
-        <w:pStyle w:val="Prrafodelista"/>
-        <w:numPr>
-          <w:ilvl w:val="0"/>
-          <w:numId w:val="6"/>
-        </w:numPr>
-        <w:tabs>
-          <w:tab w:val="left" w:pos="1014"/>
-        </w:tabs>
-        <w:spacing w:before="203" w:line="360" w:lineRule="auto"/>
-        <w:ind w:right="485"/>
-      </w:pPr>
-      <w:r>
-        <w:rPr>
-          <w:b/>
-        </w:rPr>
-        <w:t xml:space="preserve">CL2, N1, RA1</w:t>
-      </w:r>
-    </w:p>
-    <w:p>
-      <w:pPr>
-        <w:pStyle w:val="Prrafodelista"/>
-        <w:numPr>
-          <w:ilvl w:val="0"/>
-          <w:numId w:val="6"/>
-        </w:numPr>
-        <w:tabs>
-          <w:tab w:val="left" w:pos="1014"/>
-        </w:tabs>
-        <w:spacing w:before="203" w:line="360" w:lineRule="auto"/>
-        <w:ind w:right="485"/>
-      </w:pPr>
-      <w:r>
-        <w:rPr>
-          <w:b/>
-        </w:rPr>
-        <w:t xml:space="preserve">CL1, N1, RA1</w:t>
-      </w:r>
-    </w:p>
-    <w:p>
-      <w:pPr>
-        <w:pStyle w:val="Prrafodelista"/>
-        <w:numPr>
-          <w:ilvl w:val="0"/>
-          <w:numId w:val="6"/>
-        </w:numPr>
-        <w:tabs>
-          <w:tab w:val="left" w:pos="1014"/>
-        </w:tabs>
-        <w:spacing w:before="203" w:line="360" w:lineRule="auto"/>
-        <w:ind w:right="485"/>
-      </w:pPr>
-      <w:r>
-        <w:rPr>
-          <w:b/>
-        </w:rPr>
-        <w:t xml:space="preserve">CG1, N2, RA2</w:t>
-      </w:r>
-    </w:p>
-    <w:p>
-      <w:pPr>
-        <w:pStyle w:val="Prrafodelista"/>
-        <w:numPr>
-          <w:ilvl w:val="0"/>
-          <w:numId w:val="6"/>
-        </w:numPr>
-        <w:tabs>
-          <w:tab w:val="left" w:pos="1014"/>
-        </w:tabs>
-        <w:spacing w:before="203" w:line="360" w:lineRule="auto"/>
-        <w:ind w:right="485"/>
-      </w:pPr>
-      <w:r>
-        <w:rPr>
-          <w:b/>
-        </w:rPr>
-        <w:t xml:space="preserve">CE2, N1, RA2</w:t>
-      </w:r>
-    </w:p>
-    <w:p>
-      <w:pPr>
-        <w:pStyle w:val="Prrafodelista"/>
-        <w:numPr>
-          <w:ilvl w:val="0"/>
-          <w:numId w:val="6"/>
-        </w:numPr>
-        <w:tabs>
-          <w:tab w:val="left" w:pos="1014"/>
-        </w:tabs>
-        <w:spacing w:before="203" w:line="360" w:lineRule="auto"/>
-        <w:ind w:right="485"/>
-      </w:pPr>
-      <w:r>
-        <w:rPr>
-          <w:b/>
-        </w:rPr>
-        <w:t xml:space="preserve">CE1, N1, RA2</w:t>
-      </w:r>
     </w:p>
     <w:p>
       <w:pPr>

</xml_diff>